<commit_message>
Add mandatory SpringerOpen Declarations section and Cover Letter
</commit_message>
<xml_diff>
--- a/paper/LLM_Agent_IPI_Research_Paper_Complete.docx
+++ b/paper/LLM_Agent_IPI_Research_Paper_Complete.docx
@@ -2424,6 +2424,83 @@
         <w:rPr>
           <w:sz w:val="20"/>
         </w:rPr>
+        <w:t>DECLARATIONS</w:t>
+      </w:r>
+    </w:p>
+    <w:p>
+      <w:pPr>
+        <w:spacing w:after="70"/>
+        <w:ind w:firstLine="202"/>
+        <w:jc w:val="both"/>
+      </w:pPr>
+      <w:r>
+        <w:rPr>
+          <w:sz w:val="19"/>
+        </w:rPr>
+        <w:t>Availability of data and materials: The synthetic resume PDF dataset (60 PDFs), four-layer defense implementation, and evaluation scripts are publicly available at https://github.com/sairajkashid-prog/llm-agent-ipi-defense.</w:t>
+      </w:r>
+    </w:p>
+    <w:p>
+      <w:pPr>
+        <w:spacing w:after="70"/>
+        <w:ind w:firstLine="202"/>
+        <w:jc w:val="both"/>
+      </w:pPr>
+      <w:r>
+        <w:rPr>
+          <w:sz w:val="19"/>
+        </w:rPr>
+        <w:t>Competing interests: The authors declare that they have no competing interests.</w:t>
+      </w:r>
+    </w:p>
+    <w:p>
+      <w:pPr>
+        <w:spacing w:after="70"/>
+        <w:ind w:firstLine="202"/>
+        <w:jc w:val="both"/>
+      </w:pPr>
+      <w:r>
+        <w:rPr>
+          <w:sz w:val="19"/>
+        </w:rPr>
+        <w:t>Funding: This research received no external funding.</w:t>
+      </w:r>
+    </w:p>
+    <w:p>
+      <w:pPr>
+        <w:spacing w:after="70"/>
+        <w:ind w:firstLine="202"/>
+        <w:jc w:val="both"/>
+      </w:pPr>
+      <w:r>
+        <w:rPr>
+          <w:sz w:val="19"/>
+        </w:rPr>
+        <w:t>Authors' contributions: S.G. and S.K. designed the four-layer defense and implemented the evaluation pipeline. H.G. and R.J. constructed the synthetic dataset and literature review. K.S. analyzed the metrics and prepared the figures. All authors read and approved the final manuscript.</w:t>
+      </w:r>
+    </w:p>
+    <w:p>
+      <w:pPr>
+        <w:spacing w:after="70"/>
+        <w:ind w:firstLine="202"/>
+        <w:jc w:val="both"/>
+      </w:pPr>
+      <w:r>
+        <w:rPr>
+          <w:sz w:val="19"/>
+        </w:rPr>
+        <w:t>Acknowledgements: The authors thank the Department of Computer Engineering and Technology, Dr. Vishwanath Karad MIT World Peace University, Pune, India, for academic support.</w:t>
+      </w:r>
+    </w:p>
+    <w:p>
+      <w:pPr>
+        <w:spacing w:before="120" w:after="60"/>
+        <w:jc w:val="center"/>
+      </w:pPr>
+      <w:r>
+        <w:rPr>
+          <w:sz w:val="20"/>
+        </w:rPr>
         <w:t>REFERENCES</w:t>
       </w:r>
     </w:p>

</xml_diff>